<commit_message>
Document local infrastructure and clarify project scope
</commit_message>
<xml_diff>
--- a/docs/functional/Kairos_Functional_Requirements.docx
+++ b/docs/functional/Kairos_Functional_Requirements.docx
@@ -83,7 +83,7 @@
         <w:jc w:val="center"/>
       </w:pPr>
       <w:r>
-        <w:t>Revision 0.3</w:t>
+        <w:t>Revision 0.4</w:t>
       </w:r>
     </w:p>
     <w:p>
@@ -128,7 +128,7 @@
         <w:rPr>
           <w:b w:val="0"/>
         </w:rPr>
-        <w:t>The proposed experience collects an event or commitment, clarifies missing information, and organizes it with related before-or-after activities and user-selected reminders. The intended app supports voice and text plus interactive components; Android is the first planned platform, and Italian and English are required from the beginning. In the current backend and CLI, static messages follow the interface language, while clarifications and generated text follow the conversation language.</w:t>
+        <w:t>The proposed experience collects an event or commitment, clarifies missing information, and organizes it with related before-or-after activities and user-selected reminders. The intended app supports voice and text plus interactive components; Android is the first planned platform, and Italian and English are required from the beginning. The backend, CLI, and API provide static messages in the interface language, while clarifications and generated text follow the conversation language.</w:t>
       </w:r>
     </w:p>
     <w:p>
@@ -136,7 +136,7 @@
         <w:rPr>
           <w:b w:val="0"/>
         </w:rPr>
-        <w:t>The intended proof of concept covers the journey from an intention to creating an event and receiving reminders. The current backend prepares an in-memory draft, and a first HTTP endpoint exposes the workflow. The mobile app, voice input, persistent event creation, and notification delivery remain unimplemented. The grocery-list idea is outside the first proof of concept.</w:t>
+        <w:t>The intended proof of concept covers the journey from an intention to creating an event and receiving reminders. The current backend prepares event drafts and stores the current workflow state in PostgreSQL. The mobile app, voice input, persistent event creation, calendar integration, and notification delivery remain unimplemented.</w:t>
       </w:r>
     </w:p>
     <w:p>
@@ -310,7 +310,7 @@
         <w:rPr>
           <w:b w:val="0"/>
         </w:rPr>
-        <w:t>4. The user can correct the draft and configure multiple reminders. The exact no-reminder interaction still needs definition. The backend and CLI can carry a conversation language across turns, but simulated-provider results do not guarantee language recognition by a real model.</w:t>
+        <w:t>4. The user can correct the draft and configure multiple reminders. The exact no-reminder interaction still needs definition. The backend carries the conversation language across turns; real-model language behavior requires further evaluation.</w:t>
       </w:r>
     </w:p>
     <w:p>
@@ -339,7 +339,7 @@
         <w:rPr>
           <w:b w:val="0"/>
         </w:rPr>
-        <w:t>IDs are stable to support references and revisions. “Requested” describes an explicit user intention; the criteria describe observable outcomes while leaving undecided details open.</w:t>
+        <w:t>IDs are stable to support references and revisions. Each criterion describes an observable outcome; the status column summarizes current availability.</w:t>
       </w:r>
     </w:p>
     <w:p>
@@ -384,7 +384,7 @@
           <w:b w:val="0"/>
           <w:sz w:val="20"/>
         </w:rPr>
-        <w:t xml:space="preserve">  Requested for the first version; multi-turn draft workflow is implemented in the backend.</w:t>
+        <w:t xml:space="preserve">  The multi-turn draft workflow is implemented in the backend.</w:t>
       </w:r>
     </w:p>
     <w:p>
@@ -429,7 +429,7 @@
           <w:b w:val="0"/>
           <w:sz w:val="20"/>
         </w:rPr>
-        <w:t xml:space="preserve">  Both modalities requested; voice capture and mobile interface are not implemented.</w:t>
+        <w:t xml:space="preserve">  Text input is available in the backend and CLI. Voice capture and mobile interface are not implemented.</w:t>
       </w:r>
     </w:p>
     <w:p>
@@ -474,7 +474,7 @@
           <w:b w:val="0"/>
           <w:sz w:val="20"/>
         </w:rPr>
-        <w:t xml:space="preserve">  Required for the use case; draft fields and clarifications are supported in the backend.</w:t>
+        <w:t xml:space="preserve">  Draft fields and clarifications are supported in the backend.</w:t>
       </w:r>
     </w:p>
     <w:p>
@@ -519,7 +519,7 @@
           <w:b w:val="0"/>
           <w:sz w:val="20"/>
         </w:rPr>
-        <w:t xml:space="preserve">  Requested for the first version; before/after activities are supported by the backend draft.</w:t>
+        <w:t xml:space="preserve">  Before-and-after activities are supported by the backend draft.</w:t>
       </w:r>
     </w:p>
     <w:p>
@@ -564,7 +564,7 @@
           <w:b w:val="0"/>
           <w:sz w:val="20"/>
         </w:rPr>
-        <w:t xml:space="preserve">  Requested; the draft supports multiple reminders and clarification. Notification delivery is not implemented.</w:t>
+        <w:t xml:space="preserve">  Draft reminders and clarification are supported. Notification delivery is not implemented.</w:t>
       </w:r>
     </w:p>
     <w:p>
@@ -609,7 +609,7 @@
           <w:b w:val="0"/>
           <w:sz w:val="20"/>
         </w:rPr>
-        <w:t xml:space="preserve">  Requested; multi-turn draft updates are implemented. The required fields beyond date/time remain open.</w:t>
+        <w:t xml:space="preserve">  Multi-turn draft updates are implemented. Required fields beyond date and time remain to be defined.</w:t>
       </w:r>
     </w:p>
     <w:p>
@@ -654,7 +654,7 @@
           <w:b w:val="0"/>
           <w:sz w:val="20"/>
         </w:rPr>
-        <w:t xml:space="preserve">  Corrections are supported by the workflow; a review UI and explicit confirmation before creation remain undefined.</w:t>
+        <w:t xml:space="preserve">  Draft corrections are supported. The review interface and confirmation before event creation remain undefined.</w:t>
       </w:r>
     </w:p>
     <w:p>
@@ -699,7 +699,7 @@
           <w:b w:val="0"/>
           <w:sz w:val="20"/>
         </w:rPr>
-        <w:t xml:space="preserve">  Requested; the app and interactive controls are not implemented.</w:t>
+        <w:t xml:space="preserve">  Voice input, mobile interface, and interactive controls are not implemented.</w:t>
       </w:r>
     </w:p>
     <w:p>
@@ -744,7 +744,7 @@
           <w:b w:val="0"/>
           <w:sz w:val="20"/>
         </w:rPr>
-        <w:t xml:space="preserve">  Explicit user exclusion.</w:t>
+        <w:t xml:space="preserve">  Not included in the current product scope.</w:t>
       </w:r>
     </w:p>
     <w:p>
@@ -789,7 +789,7 @@
           <w:b w:val="0"/>
           <w:sz w:val="20"/>
         </w:rPr>
-        <w:t xml:space="preserve">  Requested; the backend/CLI static catalog is complete and validated. The app is not implemented.</w:t>
+        <w:t xml:space="preserve">  The backend, CLI, and API support Italian and English. The mobile app is not implemented.</w:t>
       </w:r>
     </w:p>
     <w:p>
@@ -834,7 +834,7 @@
           <w:b w:val="0"/>
           <w:sz w:val="20"/>
         </w:rPr>
-        <w:t xml:space="preserve">  Requested; persistent profile is not implemented. Its content and controls remain open.</w:t>
+        <w:t xml:space="preserve">  Persistent profile storage and user controls are not implemented.</w:t>
       </w:r>
     </w:p>
     <w:p>
@@ -879,7 +879,7 @@
           <w:b w:val="0"/>
           <w:sz w:val="20"/>
         </w:rPr>
-        <w:t xml:space="preserve">  Option to evaluate, not an approved requirement; not implemented.</w:t>
+        <w:t xml:space="preserve">  Not implemented; onboarding design remains open.</w:t>
       </w:r>
     </w:p>
     <w:p>
@@ -924,7 +924,7 @@
           <w:b w:val="0"/>
           <w:sz w:val="20"/>
         </w:rPr>
-        <w:t xml:space="preserve">  Requested first-version goal; the current workflow prepares only an in-memory draft. Persistent creation and destination remain open.</w:t>
+        <w:t xml:space="preserve">  The current workflow prepares a draft only. Persistent event creation and its destination remain undefined.</w:t>
       </w:r>
     </w:p>
     <w:p>
@@ -969,7 +969,7 @@
           <w:b w:val="0"/>
           <w:sz w:val="20"/>
         </w:rPr>
-        <w:t xml:space="preserve">  Requested goal; notifications, delivery timing, and permission handling remain unimplemented or undefined.</w:t>
+        <w:t xml:space="preserve">  Notification delivery, timing, and permission handling are not implemented or defined.</w:t>
       </w:r>
     </w:p>
     <w:p>
@@ -992,7 +992,7 @@
         <w:rPr>
           <w:b w:val="0"/>
         </w:rPr>
-        <w:t xml:space="preserve">  Static text follows the interface language. Clarifications and generated text use one conversation language per turn. The initial preference comes from context; unsupported languages fall back to English. Clearly recognized greetings may indicate a language, while short, ambiguous, or neutral input preserves the prior choice. An explicit Italian or English request takes priority, and a later substantive message in either language may change the conversation language. Selection uses the existing model call without a separate agent or language-detection call.</w:t>
+        <w:t xml:space="preserve">  Static text follows the interface language. Clarifications and generated text use one conversation language per turn. Unsupported languages default to English. Clearly recognized greetings may indicate a language; short, ambiguous, or neutral input preserves the previous choice. An explicit request for Italian or English takes priority, and a later substantive message in either language may change the conversation language. Selection uses the existing model call without a separate language-detection call.</w:t>
       </w:r>
     </w:p>
     <w:p>
@@ -1014,7 +1014,7 @@
           <w:b w:val="0"/>
           <w:sz w:val="20"/>
         </w:rPr>
-        <w:t xml:space="preserve">  Prompt rule implemented and covered by simulated tests. A limited evaluation with Ollama `qwen3:8b` Q4_K_M (`think=False`, temperature 0, seed 42; 6 scenarios and 9 turns per variant) found failures, including Italian output for an English start and failure to retain English fallback through a French/neutral/explicit-Italian sequence. The 354-word baseline prompt remains in runtime; the compact candidate was not promoted because of semantic regressions in injection cases. No general conclusion about the model is warranted.</w:t>
+        <w:t xml:space="preserve">  Implemented in the prompt and covered by simulated tests. A limited real-model evaluation found language-selection failures in the tested configuration; see the prompt evaluation.</w:t>
       </w:r>
     </w:p>
     <w:p>
@@ -1059,7 +1059,7 @@
           <w:b w:val="0"/>
           <w:sz w:val="20"/>
         </w:rPr>
-        <w:t xml:space="preserve">  User decision of 25 October 2026. Streaming is optional and separate from tool calls. CLI behavior is implemented and simulated-provider verified; HTTP streaming is implemented but awaits local runtime verification.</w:t>
+        <w:t xml:space="preserve">  Implemented in the CLI and HTTP API. Container runtime verification is pending.</w:t>
       </w:r>
     </w:p>
     <w:p>
@@ -1104,7 +1104,7 @@
           <w:b w:val="0"/>
           <w:sz w:val="20"/>
         </w:rPr>
-        <w:t xml:space="preserve">  User decision of 25 October 2026. CLI behavior is implemented and simulated-provider verified; HTTP event mapping is implemented but awaits local runtime verification.</w:t>
+        <w:t xml:space="preserve">  Implemented in the CLI and HTTP API. Container runtime verification is pending.</w:t>
       </w:r>
     </w:p>
     <w:p>
@@ -1128,13 +1128,13 @@
         <w:rPr>
           <w:b/>
         </w:rPr>
-        <w:t>Accessibility — explicit request:</w:t>
+        <w:t>Accessibility:</w:t>
       </w:r>
       <w:r>
         <w:rPr>
           <w:b w:val="0"/>
         </w:rPr>
-        <w:t xml:space="preserve"> text must not be the only interaction method; voice, buttons, and in-app components are requested.</w:t>
+        <w:t xml:space="preserve"> text is not the only intended interaction method; voice, buttons, and in-app components are part of the product direction.</w:t>
       </w:r>
     </w:p>
     <w:p>
@@ -1150,7 +1150,7 @@
         <w:rPr>
           <w:b/>
         </w:rPr>
-        <w:t>Focus — explicit intent:</w:t>
+        <w:t>Product focus:</w:t>
       </w:r>
       <w:r>
         <w:rPr>
@@ -1172,13 +1172,13 @@
         <w:rPr>
           <w:b/>
         </w:rPr>
-        <w:t>Missing information — requested behavior:</w:t>
+        <w:t>Missing information:</w:t>
       </w:r>
       <w:r>
         <w:rPr>
           <w:b w:val="0"/>
         </w:rPr>
-        <w:t xml:space="preserve"> incomplete examples are not facts. Do not invent an unstated year, location, duration, or other detail; define precise clarification by field and scenario.</w:t>
+        <w:t xml:space="preserve"> do not invent an unstated year, location, duration, or other detail; ask for clarification when needed.</w:t>
       </w:r>
     </w:p>
     <w:p>
@@ -1194,13 +1194,13 @@
         <w:rPr>
           <w:b/>
         </w:rPr>
-        <w:t>Data and action controls — proposal to define:</w:t>
+        <w:t>Data and action controls:</w:t>
       </w:r>
       <w:r>
         <w:rPr>
           <w:b w:val="0"/>
         </w:rPr>
-        <w:t xml:space="preserve"> the user requests an accumulating essential profile, but consent, retention, editing, deletion, and assistant-action controls are not yet decided.</w:t>
+        <w:t xml:space="preserve"> consent, retention, editing, deletion, and assistant-action controls for a persistent profile remain to be defined.</w:t>
       </w:r>
     </w:p>
     <w:p>
@@ -1216,13 +1216,13 @@
         <w:rPr>
           <w:b/>
         </w:rPr>
-        <w:t>Model guardrails — recognized priority, timing open:</w:t>
+        <w:t>Model guardrails:</w:t>
       </w:r>
       <w:r>
         <w:rPr>
           <w:b w:val="0"/>
         </w:rPr>
-        <w:t xml:space="preserve"> the user considers guardrails important and placed them in the future. Bringing them into the first version is a coordinator proposal, not an approved decision. Specific behaviors and criteria remain open.</w:t>
+        <w:t xml:space="preserve"> field validation and a basic tool boundary exist. Broader prompt-injection safeguards and their evaluation criteria remain to be defined.</w:t>
       </w:r>
     </w:p>
     <w:p>
@@ -1238,7 +1238,7 @@
         <w:rPr>
           <w:b/>
         </w:rPr>
-        <w:t>Quality and outcomes — to validate:</w:t>
+        <w:t>Quality and outcomes:</w:t>
       </w:r>
       <w:r>
         <w:rPr>
@@ -1260,13 +1260,13 @@
         <w:rPr>
           <w:b/>
         </w:rPr>
-        <w:t>Language, streaming, and progress — decision of 25 October 2026:</w:t>
+        <w:t>Language, streaming, and progress:</w:t>
       </w:r>
       <w:r>
         <w:rPr>
           <w:b w:val="0"/>
         </w:rPr>
-        <w:t xml:space="preserve"> static text follows the UI language; clarifications and generated text follow the conversation language; progress messages follow the UI language. Simulated tests pass. A limited real-model language evaluation failed in the configuration described in FR-15.</w:t>
+        <w:t xml:space="preserve"> behavior is summarized in FR-15 through FR-17. Real-model language limits are described in the prompt evaluation.</w:t>
       </w:r>
     </w:p>
     <w:p>
@@ -1320,7 +1320,7 @@
         <w:rPr>
           <w:b w:val="0"/>
         </w:rPr>
-        <w:t xml:space="preserve">  Backend multi-turn in-memory drafting workflow, scripted provider, optional Ollama adapter, CLI, and initial stateless HTTP API.</w:t>
+        <w:t xml:space="preserve">  Backend multi-turn drafting workflow, scripted provider, optional Ollama adapter, CLI, and stateful HTTP API with PostgreSQL sessions.</w:t>
       </w:r>
     </w:p>
     <w:p>
@@ -1339,7 +1339,7 @@
         <w:rPr>
           <w:b w:val="0"/>
         </w:rPr>
-        <w:t xml:space="preserve">  Persistent creation, notifications, and mobile app remain unimplemented; calendar integration and reminder delivery need definition.</w:t>
+        <w:t xml:space="preserve">  Persistent event creation, notifications, and mobile app remain unimplemented; calendar integration and reminder delivery need definition.</w:t>
       </w:r>
     </w:p>
     <w:p>
@@ -1385,7 +1385,7 @@
         <w:rPr>
           <w:b w:val="0"/>
         </w:rPr>
-        <w:t xml:space="preserve">  Backend, CLI, and initial HTTP endpoint do not constitute the requested mobile experience.</w:t>
+        <w:t xml:space="preserve">  Backend, CLI, and HTTP API do not provide the requested mobile experience.</w:t>
       </w:r>
     </w:p>
     <w:p>
@@ -1477,7 +1477,7 @@
         <w:pStyle w:val="Heading2"/>
       </w:pPr>
       <w:r>
-        <w:t>Grocery list</w:t>
+        <w:t>Feedback</w:t>
       </w:r>
     </w:p>
     <w:p>
@@ -1496,7 +1496,7 @@
         <w:rPr>
           <w:b w:val="0"/>
         </w:rPr>
-        <w:t xml:space="preserve">  Excluded from the first proof of concept to preserve focus.</w:t>
+        <w:t xml:space="preserve">  Not included in the current proof of concept.</w:t>
       </w:r>
     </w:p>
     <w:p>
@@ -1534,72 +1534,7 @@
         <w:rPr>
           <w:b w:val="0"/>
         </w:rPr>
-        <w:t xml:space="preserve">  Future idea to reconsider only if it supports the product's procrastination focus.</w:t>
-      </w:r>
-    </w:p>
-    <w:p>
-      <w:pPr>
-        <w:pStyle w:val="Heading2"/>
-      </w:pPr>
-      <w:r>
-        <w:t>Feedback</w:t>
-      </w:r>
-    </w:p>
-    <w:p>
-      <w:r>
-        <w:rPr>
-          <w:b w:val="0"/>
-        </w:rPr>
-      </w:r>
-      <w:r>
-        <w:rPr>
-          <w:b/>
-        </w:rPr>
-        <w:t>Goal</w:t>
-      </w:r>
-      <w:r>
-        <w:rPr>
-          <w:b w:val="0"/>
-        </w:rPr>
-        <w:t xml:space="preserve">  Outside the first proof-of-concept scope.</w:t>
-      </w:r>
-    </w:p>
-    <w:p>
-      <w:r>
-        <w:rPr>
-          <w:b w:val="0"/>
-        </w:rPr>
-      </w:r>
-      <w:r>
-        <w:rPr>
-          <w:b/>
-        </w:rPr>
-        <w:t>Current availability</w:t>
-      </w:r>
-      <w:r>
-        <w:rPr>
-          <w:b w:val="0"/>
-        </w:rPr>
-        <w:t xml:space="preserve">  Not implemented.</w:t>
-      </w:r>
-    </w:p>
-    <w:p>
-      <w:r>
-        <w:rPr>
-          <w:b w:val="0"/>
-        </w:rPr>
-      </w:r>
-      <w:r>
-        <w:rPr>
-          <w:b/>
-        </w:rPr>
-        <w:t>Future work</w:t>
-      </w:r>
-      <w:r>
-        <w:rPr>
-          <w:b w:val="0"/>
-        </w:rPr>
-        <w:t xml:space="preserve">  Future idea: collect and organize feedback; human review is a proposal, not a decision.</w:t>
+        <w:t xml:space="preserve">  Feedback collection and review flow remain undefined.</w:t>
       </w:r>
     </w:p>
     <w:p>
@@ -1626,7 +1561,7 @@
         <w:rPr>
           <w:b w:val="0"/>
         </w:rPr>
-        <w:t xml:space="preserve">  Inclusion in the first proof of concept is not approved.</w:t>
+        <w:t xml:space="preserve">  Reliable interpretation and safe handling of user input.</w:t>
       </w:r>
     </w:p>
     <w:p>
@@ -1645,7 +1580,7 @@
         <w:rPr>
           <w:b w:val="0"/>
         </w:rPr>
-        <w:t xml:space="preserve">  Argument validation and a basic tool boundary exist; this is not complete prompt-injection protection.</w:t>
+        <w:t xml:space="preserve">  Field validation and a basic tool boundary exist; comprehensive prompt-injection protection is not implemented.</w:t>
       </w:r>
     </w:p>
     <w:p>
@@ -1664,145 +1599,7 @@
         <w:rPr>
           <w:b w:val="0"/>
         </w:rPr>
-        <w:t xml:space="preserve">  The user considers guardrails important for the future; earlier inclusion is only a coordinator proposal.</w:t>
-      </w:r>
-    </w:p>
-    <w:p>
-      <w:pPr>
-        <w:pStyle w:val="Heading2"/>
-      </w:pPr>
-      <w:r>
-        <w:t>Language streaming and progress</w:t>
-      </w:r>
-    </w:p>
-    <w:p>
-      <w:r>
-        <w:rPr>
-          <w:b w:val="0"/>
-        </w:rPr>
-      </w:r>
-      <w:r>
-        <w:rPr>
-          <w:b/>
-        </w:rPr>
-        <w:t>Goal</w:t>
-      </w:r>
-      <w:r>
-        <w:rPr>
-          <w:b w:val="0"/>
-        </w:rPr>
-        <w:t xml:space="preserve">  Complete Italian/English static strings; one conversation language for generated text and clarifications; optional text streaming; static progress tied to real workflow phases.</w:t>
-      </w:r>
-    </w:p>
-    <w:p>
-      <w:r>
-        <w:rPr>
-          <w:b w:val="0"/>
-        </w:rPr>
-      </w:r>
-      <w:r>
-        <w:rPr>
-          <w:b/>
-        </w:rPr>
-        <w:t>Current availability</w:t>
-      </w:r>
-      <w:r>
-        <w:rPr>
-          <w:b w:val="0"/>
-        </w:rPr>
-        <w:t xml:space="preserve">  Implemented in backend and CLI with simulated-provider verification; initial HTTP mapping is implemented and awaits runtime verification. Limited real-model evaluation found language failures.</w:t>
-      </w:r>
-    </w:p>
-    <w:p>
-      <w:r>
-        <w:rPr>
-          <w:b w:val="0"/>
-        </w:rPr>
-      </w:r>
-      <w:r>
-        <w:rPr>
-          <w:b/>
-        </w:rPr>
-        <w:t>Future work</w:t>
-      </w:r>
-      <w:r>
-        <w:rPr>
-          <w:b w:val="0"/>
-        </w:rPr>
-        <w:t xml:space="preserve">  Mobile UI, persistence, and notifications are outside the current decision.</w:t>
-      </w:r>
-    </w:p>
-    <w:p>
-      <w:pPr>
-        <w:pStyle w:val="Heading2"/>
-      </w:pPr>
-      <w:r>
-        <w:t>First steps timely invitations and restarting</w:t>
-      </w:r>
-    </w:p>
-    <w:p>
-      <w:r>
-        <w:rPr>
-          <w:b w:val="0"/>
-        </w:rPr>
-      </w:r>
-      <w:r>
-        <w:rPr>
-          <w:b/>
-        </w:rPr>
-        <w:t>Goal</w:t>
-      </w:r>
-      <w:r>
-        <w:rPr>
-          <w:b w:val="0"/>
-        </w:rPr>
-        <w:t xml:space="preserve">  Not approved as first-version requirements in the available sources.</w:t>
-      </w:r>
-    </w:p>
-    <w:p>
-      <w:r>
-        <w:rPr>
-          <w:b w:val="0"/>
-        </w:rPr>
-      </w:r>
-      <w:r>
-        <w:rPr>
-          <w:b/>
-        </w:rPr>
-        <w:t>Current availability</w:t>
-      </w:r>
-      <w:r>
-        <w:rPr>
-          <w:b w:val="0"/>
-        </w:rPr>
-        <w:t xml:space="preserve">  Not implemented.</w:t>
-      </w:r>
-    </w:p>
-    <w:p>
-      <w:r>
-        <w:rPr>
-          <w:b w:val="0"/>
-        </w:rPr>
-      </w:r>
-      <w:r>
-        <w:rPr>
-          <w:b/>
-        </w:rPr>
-        <w:t>Future work</w:t>
-      </w:r>
-      <w:r>
-        <w:rPr>
-          <w:b w:val="0"/>
-        </w:rPr>
-        <w:t xml:space="preserve">  Product proposals to discuss: suggest a small first step, offer an invitation at a chosen time, and help the user restart without blame.</w:t>
-      </w:r>
-    </w:p>
-    <w:p>
-      <w:r>
-        <w:rPr>
-          <w:b w:val="0"/>
-        </w:rPr>
-        <w:t>Current implementation status is summarized from the repository documentation; runtime availability of the new HTTP API has not yet been independently verified.</w:t>
+        <w:t xml:space="preserve">  Broader safeguards and evaluation criteria remain undefined.</w:t>
       </w:r>
     </w:p>
     <w:p>
@@ -2047,7 +1844,7 @@
                 <w:b w:val="0"/>
                 <w:sz w:val="21"/>
               </w:rPr>
-              <w:t>Initial functional baseline: explicit requirements separated from proposals and implementation status; grocery list excluded from the first proof of concept.</w:t>
+              <w:t>Initial functional baseline.</w:t>
             </w:r>
           </w:p>
         </w:tc>
@@ -2114,7 +1911,7 @@
                 <w:b w:val="0"/>
                 <w:sz w:val="21"/>
               </w:rPr>
-              <w:t>Revision 0.2: recorded and implemented decisions about conversation language, text streaming, and progress in the backend/CLI; simulated-provider verification and limited real-model language evaluation recorded.</w:t>
+              <w:t>Revision 0.2: updated language, streaming, and progress behavior and its implementation status.</w:t>
             </w:r>
           </w:p>
         </w:tc>
@@ -2181,7 +1978,74 @@
                 <w:b w:val="0"/>
                 <w:sz w:val="21"/>
               </w:rPr>
-              <w:t>Revision 0.3: recorded the initial stateless HTTP API and separated startup, functional, and technology documentation.</w:t>
+              <w:t>Revision 0.3: documented the HTTP API and organized documentation by audience.</w:t>
+            </w:r>
+          </w:p>
+        </w:tc>
+      </w:tr>
+      <w:tr>
+        <w:trPr>
+          <w:cantSplit/>
+        </w:trPr>
+        <w:tc>
+          <w:tcPr>
+            <w:tcW w:type="dxa" w:w="2160"/>
+            <w:vAlign w:val="center"/>
+            <w:tcBorders>
+              <w:top w:val="single" w:sz="4" w:color="D9D9D9"/>
+              <w:left w:val="single" w:sz="4" w:color="D9D9D9"/>
+              <w:bottom w:val="single" w:sz="4" w:color="D9D9D9"/>
+              <w:right w:val="single" w:sz="4" w:color="D9D9D9"/>
+            </w:tcBorders>
+            <w:tcMar>
+              <w:top w:w="110" w:type="dxa"/>
+              <w:left w:w="110" w:type="dxa"/>
+              <w:bottom w:w="110" w:type="dxa"/>
+              <w:right w:w="110" w:type="dxa"/>
+            </w:tcMar>
+            <w:shd w:fill="FFFFFF"/>
+          </w:tcPr>
+          <w:p>
+            <w:pPr>
+              <w:spacing w:after="40"/>
+            </w:pPr>
+            <w:r>
+              <w:rPr>
+                <w:b w:val="0"/>
+                <w:sz w:val="21"/>
+              </w:rPr>
+              <w:t>25 October 2026</w:t>
+            </w:r>
+          </w:p>
+        </w:tc>
+        <w:tc>
+          <w:tcPr>
+            <w:tcW w:type="dxa" w:w="7488"/>
+            <w:vAlign w:val="center"/>
+            <w:tcBorders>
+              <w:top w:val="single" w:sz="4" w:color="D9D9D9"/>
+              <w:left w:val="single" w:sz="4" w:color="D9D9D9"/>
+              <w:bottom w:val="single" w:sz="4" w:color="D9D9D9"/>
+              <w:right w:val="single" w:sz="4" w:color="D9D9D9"/>
+            </w:tcBorders>
+            <w:tcMar>
+              <w:top w:w="110" w:type="dxa"/>
+              <w:left w:w="110" w:type="dxa"/>
+              <w:bottom w:w="110" w:type="dxa"/>
+              <w:right w:w="110" w:type="dxa"/>
+            </w:tcMar>
+            <w:shd w:fill="FFFFFF"/>
+          </w:tcPr>
+          <w:p>
+            <w:pPr>
+              <w:spacing w:after="40"/>
+            </w:pPr>
+            <w:r>
+              <w:rPr>
+                <w:b w:val="0"/>
+                <w:sz w:val="21"/>
+              </w:rPr>
+              <w:t>Revision 0.4: updated API persistence, implementation status, and scope.</w:t>
             </w:r>
           </w:p>
         </w:tc>
@@ -2215,7 +2079,7 @@
       <w:rPr>
         <w:sz w:val="18"/>
       </w:rPr>
-      <w:t xml:space="preserve">Kairos  ·  0.3  ·  </w:t>
+      <w:t xml:space="preserve">Kairos  ·  0.4  ·  </w:t>
     </w:r>
     <w:fldSimple w:instr="PAGE"/>
   </w:p>

</xml_diff>

<commit_message>
Add draft guidance and modularize backend packages
</commit_message>
<xml_diff>
--- a/docs/functional/Kairos_Functional_Requirements.docx
+++ b/docs/functional/Kairos_Functional_Requirements.docx
@@ -83,7 +83,7 @@
         <w:jc w:val="center"/>
       </w:pPr>
       <w:r>
-        <w:t>Revision 0.4</w:t>
+        <w:t>Revision 0.5</w:t>
       </w:r>
     </w:p>
     <w:p>
@@ -91,7 +91,7 @@
         <w:jc w:val="center"/>
       </w:pPr>
       <w:r>
-        <w:t>25 October 2026</w:t>
+        <w:t>26 October 2026</w:t>
       </w:r>
     </w:p>
     <w:p>
@@ -128,7 +128,7 @@
         <w:rPr>
           <w:b w:val="0"/>
         </w:rPr>
-        <w:t>The proposed experience collects an event or commitment, clarifies missing information, and organizes it with related before-or-after activities and user-selected reminders. The intended app supports voice and text plus interactive components; Android is the first planned platform, and Italian and English are required from the beginning. The backend, CLI, and API provide static messages in the interface language, while clarifications and generated text follow the conversation language.</w:t>
+        <w:t>The proposed experience collects an event or commitment, clarifies genuine ambiguity, and organizes the supplied details. Kairos extracts all explicit information into a draft, then presents required fields still missing separately from optional suggestions such as location, duration, and reminders. The user can provide any detail at any point, through free text or structured playground templates. The intended app supports voice and text plus interactive components; Android is the first planned platform, and Italian and English are required from the beginning. Static messages follow the interface language, while clarifications and generated text follow the conversation language.</w:t>
       </w:r>
     </w:p>
     <w:p>
@@ -136,7 +136,7 @@
         <w:rPr>
           <w:b w:val="0"/>
         </w:rPr>
-        <w:t>The intended proof of concept covers the journey from an intention to creating an event and receiving reminders. The current backend prepares event drafts and stores the current workflow state in PostgreSQL. The mobile app, voice input, persistent event creation, calendar integration, and notification delivery remain unimplemented.</w:t>
+        <w:t>The intended proof of concept covers the journey from an intention to creating an event and receiving reminders. The current backend prepares event drafts, stores the current workflow state in PostgreSQL, and serves a local playground with structured field templates. The mobile app, voice input, persistent event creation, calendar integration, and notification delivery remain unimplemented.</w:t>
       </w:r>
     </w:p>
     <w:p>
@@ -298,7 +298,7 @@
         <w:rPr>
           <w:b w:val="0"/>
         </w:rPr>
-        <w:t>3. Kairos organizes the supplied information and asks for required details that are missing or ambiguous. In particular, it asks the user to choose a reminder time if none was provided.</w:t>
+        <w:t>3. Kairos extracts all explicit details into a draft and presents required fields still missing separately from optional suggestions such as location, duration, and reminders.</w:t>
       </w:r>
     </w:p>
     <w:p>
@@ -310,7 +310,7 @@
         <w:rPr>
           <w:b w:val="0"/>
         </w:rPr>
-        <w:t>4. The user can correct the draft and configure multiple reminders. The exact no-reminder interaction still needs definition. The backend carries the conversation language across turns; real-model language behavior requires further evaluation.</w:t>
+        <w:t>4. The user can provide any new detail at any point, regardless of the previous question. Playground templates accept structured values; free-text chat remains available. Reminders are optional, and the user can add one or more or choose none. The backend carries the conversation language across turns; real-model language behavior requires further evaluation.</w:t>
       </w:r>
     </w:p>
     <w:p>
@@ -519,7 +519,7 @@
           <w:b w:val="0"/>
           <w:sz w:val="20"/>
         </w:rPr>
-        <w:t xml:space="preserve">  Before-and-after activities are supported by the backend draft.</w:t>
+        <w:t xml:space="preserve">  Before-and-after activities are supported by the backend draft and an explicit playground template.</w:t>
       </w:r>
     </w:p>
     <w:p>
@@ -542,7 +542,7 @@
         <w:rPr>
           <w:b w:val="0"/>
         </w:rPr>
-        <w:t xml:space="preserve">  The user can choose multiple reminders for an event. If the user does not specify when to be reminded, Kairos asks before completing the draft.</w:t>
+        <w:t xml:space="preserve">  The user can add multiple reminders or choose none. Missing reminder preferences are optional and do not block a useful draft. A reminder template accepts a number and unit.</w:t>
       </w:r>
     </w:p>
     <w:p>
@@ -564,7 +564,7 @@
           <w:b w:val="0"/>
           <w:sz w:val="20"/>
         </w:rPr>
-        <w:t xml:space="preserve">  Draft reminders and clarification are supported. Notification delivery is not implemented.</w:t>
+        <w:t xml:space="preserve">  Draft reminders and structured playground actions are implemented. Notification delivery is not implemented.</w:t>
       </w:r>
     </w:p>
     <w:p>
@@ -587,7 +587,7 @@
         <w:rPr>
           <w:b w:val="0"/>
         </w:rPr>
-        <w:t xml:space="preserve">  Kairos asks for clarification when required information is missing or ambiguity prevents a safe representation. Answers update the same draft.</w:t>
+        <w:t xml:space="preserve">  Kairos identifies required fields still missing and clarifies genuine ambiguity. Each new message may update any explicit draft field, even if it does not answer the previous question.</w:t>
       </w:r>
     </w:p>
     <w:p>
@@ -609,7 +609,7 @@
           <w:b w:val="0"/>
           <w:sz w:val="20"/>
         </w:rPr>
-        <w:t xml:space="preserve">  Multi-turn draft updates are implemented. Required fields beyond date and time remain to be defined.</w:t>
+        <w:t xml:space="preserve">  Required-field guidance and non-blocking multi-turn updates are implemented.</w:t>
       </w:r>
     </w:p>
     <w:p>
@@ -699,7 +699,7 @@
           <w:b w:val="0"/>
           <w:sz w:val="20"/>
         </w:rPr>
-        <w:t xml:space="preserve">  Voice input, mobile interface, and interactive controls are not implemented.</w:t>
+        <w:t xml:space="preserve">  The local playground has structured templates for title, date, time, location, duration, before/after activities, and reminders. Voice input and the mobile interface are not implemented.</w:t>
       </w:r>
     </w:p>
     <w:p>
@@ -1301,7 +1301,7 @@
         <w:rPr>
           <w:b w:val="0"/>
         </w:rPr>
-        <w:t xml:space="preserve">  Draft a commitment, activities before/after, clarifications, create the event, and deliver multiple reminders; Android is the planned first platform.</w:t>
+        <w:t xml:space="preserve">  Draft a commitment, activities before/after, clarify genuine ambiguity, create the event, and deliver reminders the user chose; Android is the planned first platform.</w:t>
       </w:r>
     </w:p>
     <w:p>
@@ -1320,7 +1320,7 @@
         <w:rPr>
           <w:b w:val="0"/>
         </w:rPr>
-        <w:t xml:space="preserve">  Backend multi-turn drafting workflow, scripted provider, optional Ollama adapter, CLI, and stateful HTTP API with PostgreSQL sessions.</w:t>
+        <w:t xml:space="preserve">  Backend multi-turn drafting, local playground templates, scripted provider, optional Ollama adapter, CLI, and stateful HTTP API with PostgreSQL sessions.</w:t>
       </w:r>
     </w:p>
     <w:p>
@@ -1366,7 +1366,7 @@
         <w:rPr>
           <w:b w:val="0"/>
         </w:rPr>
-        <w:t xml:space="preserve">  Voice or text, plus in-app buttons and interactive components; Italian and English.</w:t>
+        <w:t xml:space="preserve">  Voice or text, plus in-app buttons and interactive components; Italian and English. The user may provide any detail at any point.</w:t>
       </w:r>
     </w:p>
     <w:p>
@@ -1385,7 +1385,7 @@
         <w:rPr>
           <w:b w:val="0"/>
         </w:rPr>
-        <w:t xml:space="preserve">  Backend, CLI, and HTTP API do not provide the requested mobile experience.</w:t>
+        <w:t xml:space="preserve">  Backend, CLI, and HTTP API support free text; the playground also has structured templates. The requested mobile experience is not implemented.</w:t>
       </w:r>
     </w:p>
     <w:p>
@@ -1450,7 +1450,7 @@
         <w:rPr>
           <w:b w:val="0"/>
         </w:rPr>
-        <w:t xml:space="preserve">  No persistent profile; the workflow carries the current draft and latest question.</w:t>
+        <w:t xml:space="preserve">  No persistent profile; the workflow carries the current draft and any active clarification or selection.</w:t>
       </w:r>
     </w:p>
     <w:p>
@@ -1620,7 +1620,7 @@
         <w:rPr>
           <w:b w:val="0"/>
         </w:rPr>
-        <w:t>1. Which fields besides date and time are needed to complete an event? Which are required, and which require clarification?</w:t>
+        <w:t>1. Which fields besides title, date, and time are required to complete an event, and which remain optional?</w:t>
       </w:r>
     </w:p>
     <w:p>
@@ -1632,7 +1632,7 @@
         <w:rPr>
           <w:b w:val="0"/>
         </w:rPr>
-        <w:t>2. How should multiple reminders be added, changed, or removed, including the “no reminders” choice?</w:t>
+        <w:t>2. How should users add, change, or remove multiple reminders through the mobile interface?</w:t>
       </w:r>
     </w:p>
     <w:p>
@@ -2050,6 +2050,73 @@
           </w:p>
         </w:tc>
       </w:tr>
+      <w:tr>
+        <w:trPr>
+          <w:cantSplit/>
+        </w:trPr>
+        <w:tc>
+          <w:tcPr>
+            <w:tcW w:type="dxa" w:w="2160"/>
+            <w:vAlign w:val="center"/>
+            <w:tcBorders>
+              <w:top w:val="single" w:sz="4" w:color="D9D9D9"/>
+              <w:left w:val="single" w:sz="4" w:color="D9D9D9"/>
+              <w:bottom w:val="single" w:sz="4" w:color="D9D9D9"/>
+              <w:right w:val="single" w:sz="4" w:color="D9D9D9"/>
+            </w:tcBorders>
+            <w:tcMar>
+              <w:top w:w="110" w:type="dxa"/>
+              <w:left w:w="110" w:type="dxa"/>
+              <w:bottom w:w="110" w:type="dxa"/>
+              <w:right w:w="110" w:type="dxa"/>
+            </w:tcMar>
+            <w:shd w:fill="FFFFFF"/>
+          </w:tcPr>
+          <w:p>
+            <w:pPr>
+              <w:spacing w:after="40"/>
+            </w:pPr>
+            <w:r>
+              <w:rPr>
+                <w:b w:val="0"/>
+                <w:sz w:val="21"/>
+              </w:rPr>
+              <w:t>26 October 2026</w:t>
+            </w:r>
+          </w:p>
+        </w:tc>
+        <w:tc>
+          <w:tcPr>
+            <w:tcW w:type="dxa" w:w="7488"/>
+            <w:vAlign w:val="center"/>
+            <w:tcBorders>
+              <w:top w:val="single" w:sz="4" w:color="D9D9D9"/>
+              <w:left w:val="single" w:sz="4" w:color="D9D9D9"/>
+              <w:bottom w:val="single" w:sz="4" w:color="D9D9D9"/>
+              <w:right w:val="single" w:sz="4" w:color="D9D9D9"/>
+            </w:tcBorders>
+            <w:tcMar>
+              <w:top w:w="110" w:type="dxa"/>
+              <w:left w:w="110" w:type="dxa"/>
+              <w:bottom w:w="110" w:type="dxa"/>
+              <w:right w:w="110" w:type="dxa"/>
+            </w:tcMar>
+            <w:shd w:fill="FFFFFF"/>
+          </w:tcPr>
+          <w:p>
+            <w:pPr>
+              <w:spacing w:after="40"/>
+            </w:pPr>
+            <w:r>
+              <w:rPr>
+                <w:b w:val="0"/>
+                <w:sz w:val="21"/>
+              </w:rPr>
+              <w:t>Revision 0.5: introduced non-blocking draft guidance and structured playground templates.</w:t>
+            </w:r>
+          </w:p>
+        </w:tc>
+      </w:tr>
     </w:tbl>
     <w:p>
       <w:pPr>
@@ -2079,7 +2146,7 @@
       <w:rPr>
         <w:sz w:val="18"/>
       </w:rPr>
-      <w:t xml:space="preserve">Kairos  ·  0.4  ·  </w:t>
+      <w:t xml:space="preserve">Kairos  ·  0.5  ·  </w:t>
     </w:r>
     <w:fldSimple w:instr="PAGE"/>
   </w:p>

</xml_diff>